<commit_message>
feat: pert6 tema, routing & navigasi, animasi
</commit_message>
<xml_diff>
--- a/pert5/docs-tugas/docs-tugas5.docx
+++ b/pert5/docs-tugas/docs-tugas5.docx
@@ -91,7 +91,7 @@
           <w:szCs w:val="24"/>
           <w:lang w:val="id-ID"/>
         </w:rPr>
-        <w:t xml:space="preserve">Pertemuan 5: Penyimpanan Lokal (SharedPreferences dan SQLite)</w:t>
+        <w:t>Pertemuan 5: Penyimpanan Lokal (SharedPreferences dan SQLite)</w:t>
       </w:r>
     </w:p>
     <w:p>
@@ -359,7 +359,7 @@
           <w:szCs w:val="30"/>
           <w:lang w:val="id-ID"/>
         </w:rPr>
-        <w:t xml:space="preserve">1. Tugas: Pencatat Pengeluaran</w:t>
+        <w:t>1. Tugas: Pencatat Pengeluaran</w:t>
       </w:r>
     </w:p>
     <w:p>
@@ -377,79 +377,79 @@
           <w:szCs w:val="22"/>
           <w:lang w:val="id-ID"/>
         </w:rPr>
-        <w:t xml:space="preserve">Aplikasi pencatat pengeluaran yang menyimpan data secara lokal di perangkat. Data dimodelkan dengan class Pengeluaran (id, nama, jumlah, kategori, tanggal) yang memiliki toMap() dan factory fromMap() untuk mengubah objek menjadi baris tabel dan sebaliknya. Akses database dikumpulkan dalam class DbHelper memakai sqflite: tabel pengeluaran dibuat di onCreate dengan kolom jumlah bertipe INTEGER, lalu tersedia method tambah (INSERT), semua (SELECT dengan filter kategori opsional), ubah (UPDATE), hapus (DELETE), dan totalSemua yang menghitung total memakai SELECT SUM(jumlah). Semua query yang memakai nilai dari pengguna ditulis dengan placeholder ? dan whereArgs. Halaman PengeluaranPage membuat Future di initState() dan menampilkannya dengan FutureBuilder, dilengkapi kartu total di bagian atas, dropdown filter kategori, serta ListView berisi nama, kategori, tanggal, dan jumlah dalam format rupiah. Mengetuk item membuka form ubah, sedangkan ikon sampah menampilkan AlertDialog konfirmasi sebelum data dihapus. Halaman FormPengeluaranPage dipakai untuk tambah sekaligus ubah, dengan validasi: nama wajib diisi, jumlah wajib berupa angka lebih dari 0, kategori dipilih dari dropdown, dan tanggal dipilih lewat showDatePicker. Pengaturan yang disimpan dengan shared_preferences adalah kategori filter terakhir, sehingga daftar dan total tetap tersaring sesuai pilihan terakhir setelah aplikasi ditutup dan dibuka kembali. Seluruh data tersimpan di SQLite sehingga tetap ada setelah aplikasi dihentikan.</w:t>
-      </w:r>
-    </w:p>
-    <w:p>
-      <w:pPr>
-        <w:shd w:val="clear" w:color="auto" w:fill="F2F2F2"/>
-        <w:ind w:left="200"/>
-        <w:rPr>
-          <w:lang w:val="id-ID"/>
-        </w:rPr>
-      </w:pPr>
-      <w:r>
-        <w:rPr>
-          <w:rFonts w:ascii="Consolas" w:eastAsia="Consolas" w:hAnsi="Consolas" w:cs="Consolas"/>
-          <w:sz w:val="17"/>
-          <w:szCs w:val="17"/>
-          <w:lang w:val="id-ID"/>
-        </w:rPr>
-        <w:t xml:space="preserve">import 'package:flutter/material.dart';</w:t>
-      </w:r>
-    </w:p>
-    <w:p>
-      <w:pPr>
-        <w:shd w:val="clear" w:color="auto" w:fill="F2F2F2"/>
-        <w:ind w:left="200"/>
-        <w:rPr>
-          <w:lang w:val="id-ID"/>
-        </w:rPr>
-      </w:pPr>
-      <w:r>
-        <w:rPr>
-          <w:rFonts w:ascii="Consolas" w:eastAsia="Consolas" w:hAnsi="Consolas" w:cs="Consolas"/>
-          <w:sz w:val="17"/>
-          <w:szCs w:val="17"/>
-          <w:lang w:val="id-ID"/>
-        </w:rPr>
-        <w:t xml:space="preserve">import 'package:shared_preferences/shared_preferences.dart';</w:t>
-      </w:r>
-    </w:p>
-    <w:p>
-      <w:pPr>
-        <w:shd w:val="clear" w:color="auto" w:fill="F2F2F2"/>
-        <w:ind w:left="200"/>
-        <w:rPr>
-          <w:lang w:val="id-ID"/>
-        </w:rPr>
-      </w:pPr>
-      <w:r>
-        <w:rPr>
-          <w:rFonts w:ascii="Consolas" w:eastAsia="Consolas" w:hAnsi="Consolas" w:cs="Consolas"/>
-          <w:sz w:val="17"/>
-          <w:szCs w:val="17"/>
-          <w:lang w:val="id-ID"/>
-        </w:rPr>
-        <w:t xml:space="preserve">import 'package:path/path.dart' as p;</w:t>
-      </w:r>
-    </w:p>
-    <w:p>
-      <w:pPr>
-        <w:shd w:val="clear" w:color="auto" w:fill="F2F2F2"/>
-        <w:ind w:left="200"/>
-        <w:rPr>
-          <w:lang w:val="id-ID"/>
-        </w:rPr>
-      </w:pPr>
-      <w:r>
-        <w:rPr>
-          <w:rFonts w:ascii="Consolas" w:eastAsia="Consolas" w:hAnsi="Consolas" w:cs="Consolas"/>
-          <w:sz w:val="17"/>
-          <w:szCs w:val="17"/>
-          <w:lang w:val="id-ID"/>
-        </w:rPr>
-        <w:t xml:space="preserve">import 'package:sqflite/sqflite.dart';</w:t>
+        <w:t>Aplikasi pencatat pengeluaran yang menyimpan data secara lokal di perangkat. Data dimodelkan dengan class Pengeluaran (id, nama, jumlah, kategori, tanggal) yang memiliki toMap() dan factory fromMap() untuk mengubah objek menjadi baris tabel dan sebaliknya. Akses database dikumpulkan dalam class DbHelper memakai sqflite: tabel pengeluaran dibuat di onCreate dengan kolom jumlah bertipe INTEGER, lalu tersedia method tambah (INSERT), semua (SELECT dengan filter kategori opsional), ubah (UPDATE), hapus (DELETE), dan totalSemua yang menghitung total memakai SELECT SUM(jumlah). Semua query yang memakai nilai dari pengguna ditulis dengan placeholder ? dan whereArgs. Halaman PengeluaranPage membuat Future di initState() dan menampilkannya dengan FutureBuilder, dilengkapi kartu total di bagian atas, dropdown filter kategori, serta ListView berisi nama, kategori, tanggal, dan jumlah dalam format rupiah. Mengetuk item membuka form ubah, sedangkan ikon sampah menampilkan AlertDialog konfirmasi sebelum data dihapus. Halaman FormPengeluaranPage dipakai untuk tambah sekaligus ubah, dengan validasi: nama wajib diisi, jumlah wajib berupa angka lebih dari 0, kategori dipilih dari dropdown, dan tanggal dipilih lewat showDatePicker. Pengaturan yang disimpan dengan shared_preferences adalah kategori filter terakhir, sehingga daftar dan total tetap tersaring sesuai pilihan terakhir setelah aplikasi ditutup dan dibuka kembali. Seluruh data tersimpan di SQLite sehingga tetap ada setelah aplikasi dihentikan.</w:t>
+      </w:r>
+    </w:p>
+    <w:p>
+      <w:pPr>
+        <w:shd w:val="clear" w:color="auto" w:fill="F2F2F2"/>
+        <w:ind w:left="200"/>
+        <w:rPr>
+          <w:lang w:val="id-ID"/>
+        </w:rPr>
+      </w:pPr>
+      <w:r>
+        <w:rPr>
+          <w:rFonts w:ascii="Consolas" w:eastAsia="Consolas" w:hAnsi="Consolas" w:cs="Consolas"/>
+          <w:sz w:val="17"/>
+          <w:szCs w:val="17"/>
+          <w:lang w:val="id-ID"/>
+        </w:rPr>
+        <w:t>import 'package:flutter/material.dart';</w:t>
+      </w:r>
+    </w:p>
+    <w:p>
+      <w:pPr>
+        <w:shd w:val="clear" w:color="auto" w:fill="F2F2F2"/>
+        <w:ind w:left="200"/>
+        <w:rPr>
+          <w:lang w:val="id-ID"/>
+        </w:rPr>
+      </w:pPr>
+      <w:r>
+        <w:rPr>
+          <w:rFonts w:ascii="Consolas" w:eastAsia="Consolas" w:hAnsi="Consolas" w:cs="Consolas"/>
+          <w:sz w:val="17"/>
+          <w:szCs w:val="17"/>
+          <w:lang w:val="id-ID"/>
+        </w:rPr>
+        <w:t>import 'package:shared_preferences/shared_preferences.dart';</w:t>
+      </w:r>
+    </w:p>
+    <w:p>
+      <w:pPr>
+        <w:shd w:val="clear" w:color="auto" w:fill="F2F2F2"/>
+        <w:ind w:left="200"/>
+        <w:rPr>
+          <w:lang w:val="id-ID"/>
+        </w:rPr>
+      </w:pPr>
+      <w:r>
+        <w:rPr>
+          <w:rFonts w:ascii="Consolas" w:eastAsia="Consolas" w:hAnsi="Consolas" w:cs="Consolas"/>
+          <w:sz w:val="17"/>
+          <w:szCs w:val="17"/>
+          <w:lang w:val="id-ID"/>
+        </w:rPr>
+        <w:t>import 'package:path/path.dart' as p;</w:t>
+      </w:r>
+    </w:p>
+    <w:p>
+      <w:pPr>
+        <w:shd w:val="clear" w:color="auto" w:fill="F2F2F2"/>
+        <w:ind w:left="200"/>
+        <w:rPr>
+          <w:lang w:val="id-ID"/>
+        </w:rPr>
+      </w:pPr>
+      <w:r>
+        <w:rPr>
+          <w:rFonts w:ascii="Consolas" w:eastAsia="Consolas" w:hAnsi="Consolas" w:cs="Consolas"/>
+          <w:sz w:val="17"/>
+          <w:szCs w:val="17"/>
+          <w:lang w:val="id-ID"/>
+        </w:rPr>
+        <w:t>import 'package:sqflite/sqflite.dart';</w:t>
       </w:r>
     </w:p>
     <w:p>
@@ -485,7 +485,7 @@
           <w:szCs w:val="17"/>
           <w:lang w:val="id-ID"/>
         </w:rPr>
-        <w:t xml:space="preserve">void main() =&gt; runApp(const MyApp());</w:t>
+        <w:t>void main() =&gt; runApp(const MyApp());</w:t>
       </w:r>
     </w:p>
     <w:p>
@@ -521,7 +521,7 @@
           <w:szCs w:val="17"/>
           <w:lang w:val="id-ID"/>
         </w:rPr>
-        <w:t xml:space="preserve">const kategoriList = ['Makanan', 'Transportasi', 'Hiburan', 'Belanja', 'Lainnya'];</w:t>
+        <w:t>const kategoriList = ['Makanan', 'Transportasi', 'Hiburan', 'Belanja', 'Lainnya'];</w:t>
       </w:r>
     </w:p>
     <w:p>
@@ -557,7 +557,7 @@
           <w:szCs w:val="17"/>
           <w:lang w:val="id-ID"/>
         </w:rPr>
-        <w:t xml:space="preserve">String formatRupiah(int nilai) {</w:t>
+        <w:t>String formatRupiah(int nilai) {</w:t>
       </w:r>
     </w:p>
     <w:p>
@@ -719,7 +719,7 @@
           <w:szCs w:val="17"/>
           <w:lang w:val="id-ID"/>
         </w:rPr>
-        <w:t xml:space="preserve">}</w:t>
+        <w:t>}</w:t>
       </w:r>
     </w:p>
     <w:p>
@@ -755,7 +755,7 @@
           <w:szCs w:val="17"/>
           <w:lang w:val="id-ID"/>
         </w:rPr>
-        <w:t xml:space="preserve">class MyApp extends StatelessWidget {</w:t>
+        <w:t>class MyApp extends StatelessWidget {</w:t>
       </w:r>
     </w:p>
     <w:p>
@@ -899,6 +899,7 @@
           <w:szCs w:val="17"/>
           <w:lang w:val="id-ID"/>
         </w:rPr>
+        <w:lastRenderedPageBreak/>
         <w:t xml:space="preserve">    );</w:t>
       </w:r>
     </w:p>
@@ -935,7 +936,7 @@
           <w:szCs w:val="17"/>
           <w:lang w:val="id-ID"/>
         </w:rPr>
-        <w:t xml:space="preserve">}</w:t>
+        <w:t>}</w:t>
       </w:r>
     </w:p>
     <w:p>
@@ -971,7 +972,7 @@
           <w:szCs w:val="17"/>
           <w:lang w:val="id-ID"/>
         </w:rPr>
-        <w:t xml:space="preserve">class Pengeluaran {</w:t>
+        <w:t>class Pengeluaran {</w:t>
       </w:r>
     </w:p>
     <w:p>
@@ -1511,7 +1512,7 @@
           <w:szCs w:val="17"/>
           <w:lang w:val="id-ID"/>
         </w:rPr>
-        <w:t xml:space="preserve">}</w:t>
+        <w:t>}</w:t>
       </w:r>
     </w:p>
     <w:p>
@@ -1547,7 +1548,7 @@
           <w:szCs w:val="17"/>
           <w:lang w:val="id-ID"/>
         </w:rPr>
-        <w:t xml:space="preserve">class DbHelper {</w:t>
+        <w:t>class DbHelper {</w:t>
       </w:r>
     </w:p>
     <w:p>
@@ -2123,6 +2124,7 @@
           <w:szCs w:val="17"/>
           <w:lang w:val="id-ID"/>
         </w:rPr>
+        <w:lastRenderedPageBreak/>
         <w:t xml:space="preserve">      where: kategori == 'Semua' ? null : 'kategori = ?',</w:t>
       </w:r>
     </w:p>
@@ -2591,7 +2593,7 @@
           <w:szCs w:val="17"/>
           <w:lang w:val="id-ID"/>
         </w:rPr>
-        <w:t xml:space="preserve">}</w:t>
+        <w:t>}</w:t>
       </w:r>
     </w:p>
     <w:p>
@@ -2627,7 +2629,7 @@
           <w:szCs w:val="17"/>
           <w:lang w:val="id-ID"/>
         </w:rPr>
-        <w:t xml:space="preserve">class PengeluaranPage extends StatefulWidget {</w:t>
+        <w:t>class PengeluaranPage extends StatefulWidget {</w:t>
       </w:r>
     </w:p>
     <w:p>
@@ -2717,7 +2719,7 @@
           <w:szCs w:val="17"/>
           <w:lang w:val="id-ID"/>
         </w:rPr>
-        <w:t xml:space="preserve">}</w:t>
+        <w:t>}</w:t>
       </w:r>
     </w:p>
     <w:p>
@@ -2753,7 +2755,7 @@
           <w:szCs w:val="17"/>
           <w:lang w:val="id-ID"/>
         </w:rPr>
-        <w:t xml:space="preserve">class _PengeluaranPageState extends State&lt;PengeluaranPage&gt; {</w:t>
+        <w:t>class _PengeluaranPageState extends State&lt;PengeluaranPage&gt; {</w:t>
       </w:r>
     </w:p>
     <w:p>
@@ -3347,6 +3349,7 @@
           <w:szCs w:val="17"/>
           <w:lang w:val="id-ID"/>
         </w:rPr>
+        <w:lastRenderedPageBreak/>
         <w:t xml:space="preserve">    DbHelper.totalSemua(kategori: _filterKategori).then((t) {</w:t>
       </w:r>
     </w:p>
@@ -4589,6 +4592,7 @@
           <w:szCs w:val="17"/>
           <w:lang w:val="id-ID"/>
         </w:rPr>
+        <w:lastRenderedPageBreak/>
         <w:t xml:space="preserve">                }</w:t>
       </w:r>
     </w:p>
@@ -5579,7 +5583,7 @@
           <w:szCs w:val="17"/>
           <w:lang w:val="id-ID"/>
         </w:rPr>
-        <w:t xml:space="preserve">}</w:t>
+        <w:t>}</w:t>
       </w:r>
     </w:p>
     <w:p>
@@ -5615,7 +5619,7 @@
           <w:szCs w:val="17"/>
           <w:lang w:val="id-ID"/>
         </w:rPr>
-        <w:t xml:space="preserve">class FormPengeluaranPage extends StatefulWidget {</w:t>
+        <w:t>class FormPengeluaranPage extends StatefulWidget {</w:t>
       </w:r>
     </w:p>
     <w:p>
@@ -5741,7 +5745,7 @@
           <w:szCs w:val="17"/>
           <w:lang w:val="id-ID"/>
         </w:rPr>
-        <w:t xml:space="preserve">}</w:t>
+        <w:t>}</w:t>
       </w:r>
     </w:p>
     <w:p>
@@ -5777,7 +5781,7 @@
           <w:szCs w:val="17"/>
           <w:lang w:val="id-ID"/>
         </w:rPr>
-        <w:t xml:space="preserve">class _FormPengeluaranPageState extends State&lt;FormPengeluaranPage&gt; {</w:t>
+        <w:t>class _FormPengeluaranPageState extends State&lt;FormPengeluaranPage&gt; {</w:t>
       </w:r>
     </w:p>
     <w:p>
@@ -5831,6 +5835,7 @@
           <w:szCs w:val="17"/>
           <w:lang w:val="id-ID"/>
         </w:rPr>
+        <w:lastRenderedPageBreak/>
         <w:t xml:space="preserve">  late final TextEditingController _jumlah;</w:t>
       </w:r>
     </w:p>
@@ -7073,6 +7078,7 @@
           <w:szCs w:val="17"/>
           <w:lang w:val="id-ID"/>
         </w:rPr>
+        <w:lastRenderedPageBreak/>
         <w:t xml:space="preserve">              validator: (v) =&gt;</w:t>
       </w:r>
     </w:p>
@@ -7955,145 +7961,259 @@
           <w:szCs w:val="17"/>
           <w:lang w:val="id-ID"/>
         </w:rPr>
-        <w:t xml:space="preserve">}</w:t>
+        <w:t>}</w:t>
       </w:r>
     </w:p>
     <w:p/>
-    <w:p>
-      <w:pPr>
-        <w:pBdr>
-          <w:top w:val="dashed" w:sz="6" w:space="12" w:color="A6A6A6"/>
-          <w:left w:val="dashed" w:sz="6" w:space="12" w:color="A6A6A6"/>
-          <w:bottom w:val="dashed" w:sz="6" w:space="12" w:color="A6A6A6"/>
-          <w:right w:val="dashed" w:sz="6" w:space="12" w:color="A6A6A6"/>
-        </w:pBdr>
-        <w:spacing w:after="240" w:before="240"/>
-        <w:jc w:val="center"/>
-        <w:rPr>
-          <w:lang w:val="id-ID"/>
-        </w:rPr>
-      </w:pPr>
-      <w:r>
-        <w:rPr>
-          <w:rFonts w:ascii="Calibri" w:eastAsia="Calibri" w:hAnsi="Calibri" w:cs="Calibri"/>
-          <w:i/>
-          <w:color w:val="7F7F7F"/>
-          <w:sz w:val="22"/>
-          <w:szCs w:val="22"/>
-          <w:lang w:val="id-ID"/>
-        </w:rPr>
-        <w:t xml:space="preserve">[Screenshot 1: Halaman daftar pengeluaran beserta kartu total]</w:t>
-      </w:r>
-    </w:p>
     <w:p/>
-    <w:p>
-      <w:pPr>
-        <w:pBdr>
-          <w:top w:val="dashed" w:sz="6" w:space="12" w:color="A6A6A6"/>
-          <w:left w:val="dashed" w:sz="6" w:space="12" w:color="A6A6A6"/>
-          <w:bottom w:val="dashed" w:sz="6" w:space="12" w:color="A6A6A6"/>
-          <w:right w:val="dashed" w:sz="6" w:space="12" w:color="A6A6A6"/>
-        </w:pBdr>
-        <w:spacing w:after="240" w:before="240"/>
-        <w:jc w:val="center"/>
-        <w:rPr>
-          <w:lang w:val="id-ID"/>
-        </w:rPr>
-      </w:pPr>
-      <w:r>
-        <w:rPr>
-          <w:rFonts w:ascii="Calibri" w:eastAsia="Calibri" w:hAnsi="Calibri" w:cs="Calibri"/>
-          <w:i/>
-          <w:color w:val="7F7F7F"/>
-          <w:sz w:val="22"/>
-          <w:szCs w:val="22"/>
-          <w:lang w:val="id-ID"/>
-        </w:rPr>
-        <w:t xml:space="preserve">[Screenshot 2: Form tambah pengeluaran (nama, jumlah, kategori, tanggal)]</w:t>
-      </w:r>
-    </w:p>
     <w:p/>
     <w:p>
-      <w:pPr>
-        <w:pBdr>
-          <w:top w:val="dashed" w:sz="6" w:space="12" w:color="A6A6A6"/>
-          <w:left w:val="dashed" w:sz="6" w:space="12" w:color="A6A6A6"/>
-          <w:bottom w:val="dashed" w:sz="6" w:space="12" w:color="A6A6A6"/>
-          <w:right w:val="dashed" w:sz="6" w:space="12" w:color="A6A6A6"/>
-        </w:pBdr>
-        <w:spacing w:after="240" w:before="240"/>
-        <w:jc w:val="center"/>
-        <w:rPr>
-          <w:lang w:val="id-ID"/>
-        </w:rPr>
-      </w:pPr>
-      <w:r>
-        <w:rPr>
-          <w:rFonts w:ascii="Calibri" w:eastAsia="Calibri" w:hAnsi="Calibri" w:cs="Calibri"/>
-          <w:i/>
-          <w:color w:val="7F7F7F"/>
-          <w:sz w:val="22"/>
-          <w:szCs w:val="22"/>
-          <w:lang w:val="id-ID"/>
-        </w:rPr>
-        <w:t xml:space="preserve">[Screenshot 3: Pesan error validasi (nama kosong / jumlah 0 atau bukan angka)]</w:t>
-      </w:r>
-    </w:p>
-    <w:p/>
-    <w:p>
-      <w:pPr>
-        <w:pBdr>
-          <w:top w:val="dashed" w:sz="6" w:space="12" w:color="A6A6A6"/>
-          <w:left w:val="dashed" w:sz="6" w:space="12" w:color="A6A6A6"/>
-          <w:bottom w:val="dashed" w:sz="6" w:space="12" w:color="A6A6A6"/>
-          <w:right w:val="dashed" w:sz="6" w:space="12" w:color="A6A6A6"/>
-        </w:pBdr>
-        <w:spacing w:after="240" w:before="240"/>
-        <w:jc w:val="center"/>
-        <w:rPr>
-          <w:lang w:val="id-ID"/>
-        </w:rPr>
-      </w:pPr>
-      <w:r>
-        <w:rPr>
-          <w:rFonts w:ascii="Calibri" w:eastAsia="Calibri" w:hAnsi="Calibri" w:cs="Calibri"/>
-          <w:i/>
-          <w:color w:val="7F7F7F"/>
-          <w:sz w:val="22"/>
-          <w:szCs w:val="22"/>
-          <w:lang w:val="id-ID"/>
-        </w:rPr>
-        <w:t xml:space="preserve">[Screenshot 4: Daftar dan total setelah filter kategori dipilih]</w:t>
-      </w:r>
-    </w:p>
-    <w:p/>
-    <w:p>
-      <w:pPr>
-        <w:pBdr>
-          <w:top w:val="dashed" w:sz="6" w:space="12" w:color="A6A6A6"/>
-          <w:left w:val="dashed" w:sz="6" w:space="12" w:color="A6A6A6"/>
-          <w:bottom w:val="dashed" w:sz="6" w:space="12" w:color="A6A6A6"/>
-          <w:right w:val="dashed" w:sz="6" w:space="12" w:color="A6A6A6"/>
-        </w:pBdr>
-        <w:spacing w:after="240" w:before="240"/>
-        <w:jc w:val="center"/>
-        <w:rPr>
-          <w:lang w:val="id-ID"/>
-        </w:rPr>
-      </w:pPr>
-      <w:r>
-        <w:rPr>
-          <w:rFonts w:ascii="Calibri" w:eastAsia="Calibri" w:hAnsi="Calibri" w:cs="Calibri"/>
-          <w:i/>
-          <w:color w:val="7F7F7F"/>
-          <w:sz w:val="22"/>
-          <w:szCs w:val="22"/>
-          <w:lang w:val="id-ID"/>
-        </w:rPr>
-        <w:t xml:space="preserve">[Screenshot 5: Bukti data dan filter terakhir masih ada setelah aplikasi dihentikan lalu dijalankan ulang]</w:t>
-      </w:r>
-    </w:p>
-    <w:p/>
+      <w:r>
+        <w:br/>
+      </w:r>
+    </w:p>
+    <w:p>
+      <w:r>
+        <w:br w:type="page"/>
+      </w:r>
+      <w:r>
+        <w:lastRenderedPageBreak/>
+        <w:br/>
+      </w:r>
+    </w:p>
+    <w:p>
+      <w:r>
+        <w:drawing>
+          <wp:anchor distT="0" distB="0" distL="114300" distR="114300" simplePos="0" relativeHeight="251658240" behindDoc="1" locked="0" layoutInCell="1" allowOverlap="1" wp14:anchorId="7F88BEA0" wp14:editId="7B8BBC20">
+            <wp:simplePos x="0" y="0"/>
+            <wp:positionH relativeFrom="margin">
+              <wp:posOffset>104775</wp:posOffset>
+            </wp:positionH>
+            <wp:positionV relativeFrom="paragraph">
+              <wp:posOffset>10795</wp:posOffset>
+            </wp:positionV>
+            <wp:extent cx="2105025" cy="4454170"/>
+            <wp:effectExtent l="0" t="0" r="0" b="3810"/>
+            <wp:wrapNone/>
+            <wp:docPr id="924114165" name="Picture 1"/>
+            <wp:cNvGraphicFramePr>
+              <a:graphicFrameLocks xmlns:a="http://schemas.openxmlformats.org/drawingml/2006/main" noChangeAspect="1"/>
+            </wp:cNvGraphicFramePr>
+            <a:graphic xmlns:a="http://schemas.openxmlformats.org/drawingml/2006/main">
+              <a:graphicData uri="http://schemas.openxmlformats.org/drawingml/2006/picture">
+                <pic:pic xmlns:pic="http://schemas.openxmlformats.org/drawingml/2006/picture">
+                  <pic:nvPicPr>
+                    <pic:cNvPr id="924114165" name=""/>
+                    <pic:cNvPicPr/>
+                  </pic:nvPicPr>
+                  <pic:blipFill>
+                    <a:blip r:embed="rId5">
+                      <a:extLst>
+                        <a:ext uri="{28A0092B-C50C-407E-A947-70E740481C1C}">
+                          <a14:useLocalDpi xmlns:a14="http://schemas.microsoft.com/office/drawing/2010/main" val="0"/>
+                        </a:ext>
+                      </a:extLst>
+                    </a:blip>
+                    <a:stretch>
+                      <a:fillRect/>
+                    </a:stretch>
+                  </pic:blipFill>
+                  <pic:spPr>
+                    <a:xfrm>
+                      <a:off x="0" y="0"/>
+                      <a:ext cx="2105025" cy="4454170"/>
+                    </a:xfrm>
+                    <a:prstGeom prst="rect">
+                      <a:avLst/>
+                    </a:prstGeom>
+                  </pic:spPr>
+                </pic:pic>
+              </a:graphicData>
+            </a:graphic>
+            <wp14:sizeRelH relativeFrom="margin">
+              <wp14:pctWidth>0</wp14:pctWidth>
+            </wp14:sizeRelH>
+            <wp14:sizeRelV relativeFrom="margin">
+              <wp14:pctHeight>0</wp14:pctHeight>
+            </wp14:sizeRelV>
+          </wp:anchor>
+        </w:drawing>
+      </w:r>
+      <w:r>
+        <w:drawing>
+          <wp:anchor distT="0" distB="0" distL="114300" distR="114300" simplePos="0" relativeHeight="251659264" behindDoc="1" locked="0" layoutInCell="1" allowOverlap="1" wp14:anchorId="36953DA3" wp14:editId="64450951">
+            <wp:simplePos x="0" y="0"/>
+            <wp:positionH relativeFrom="margin">
+              <wp:posOffset>3265805</wp:posOffset>
+            </wp:positionH>
+            <wp:positionV relativeFrom="paragraph">
+              <wp:posOffset>37465</wp:posOffset>
+            </wp:positionV>
+            <wp:extent cx="2152650" cy="4435557"/>
+            <wp:effectExtent l="0" t="0" r="0" b="3175"/>
+            <wp:wrapNone/>
+            <wp:docPr id="1558310701" name="Picture 1"/>
+            <wp:cNvGraphicFramePr>
+              <a:graphicFrameLocks xmlns:a="http://schemas.openxmlformats.org/drawingml/2006/main" noChangeAspect="1"/>
+            </wp:cNvGraphicFramePr>
+            <a:graphic xmlns:a="http://schemas.openxmlformats.org/drawingml/2006/main">
+              <a:graphicData uri="http://schemas.openxmlformats.org/drawingml/2006/picture">
+                <pic:pic xmlns:pic="http://schemas.openxmlformats.org/drawingml/2006/picture">
+                  <pic:nvPicPr>
+                    <pic:cNvPr id="1558310701" name=""/>
+                    <pic:cNvPicPr/>
+                  </pic:nvPicPr>
+                  <pic:blipFill>
+                    <a:blip r:embed="rId6">
+                      <a:extLst>
+                        <a:ext uri="{28A0092B-C50C-407E-A947-70E740481C1C}">
+                          <a14:useLocalDpi xmlns:a14="http://schemas.microsoft.com/office/drawing/2010/main" val="0"/>
+                        </a:ext>
+                      </a:extLst>
+                    </a:blip>
+                    <a:stretch>
+                      <a:fillRect/>
+                    </a:stretch>
+                  </pic:blipFill>
+                  <pic:spPr>
+                    <a:xfrm>
+                      <a:off x="0" y="0"/>
+                      <a:ext cx="2152650" cy="4435557"/>
+                    </a:xfrm>
+                    <a:prstGeom prst="rect">
+                      <a:avLst/>
+                    </a:prstGeom>
+                  </pic:spPr>
+                </pic:pic>
+              </a:graphicData>
+            </a:graphic>
+            <wp14:sizeRelH relativeFrom="margin">
+              <wp14:pctWidth>0</wp14:pctWidth>
+            </wp14:sizeRelH>
+            <wp14:sizeRelV relativeFrom="margin">
+              <wp14:pctHeight>0</wp14:pctHeight>
+            </wp14:sizeRelV>
+          </wp:anchor>
+        </w:drawing>
+      </w:r>
+      <w:r>
+        <w:drawing>
+          <wp:anchor distT="0" distB="0" distL="114300" distR="114300" simplePos="0" relativeHeight="251660288" behindDoc="1" locked="0" layoutInCell="1" allowOverlap="1" wp14:anchorId="74F48E85" wp14:editId="3DEEF0AD">
+            <wp:simplePos x="0" y="0"/>
+            <wp:positionH relativeFrom="page">
+              <wp:posOffset>4197985</wp:posOffset>
+            </wp:positionH>
+            <wp:positionV relativeFrom="paragraph">
+              <wp:posOffset>4705985</wp:posOffset>
+            </wp:positionV>
+            <wp:extent cx="2114550" cy="4412615"/>
+            <wp:effectExtent l="0" t="0" r="0" b="6985"/>
+            <wp:wrapNone/>
+            <wp:docPr id="1640686306" name="Picture 1"/>
+            <wp:cNvGraphicFramePr>
+              <a:graphicFrameLocks xmlns:a="http://schemas.openxmlformats.org/drawingml/2006/main" noChangeAspect="1"/>
+            </wp:cNvGraphicFramePr>
+            <a:graphic xmlns:a="http://schemas.openxmlformats.org/drawingml/2006/main">
+              <a:graphicData uri="http://schemas.openxmlformats.org/drawingml/2006/picture">
+                <pic:pic xmlns:pic="http://schemas.openxmlformats.org/drawingml/2006/picture">
+                  <pic:nvPicPr>
+                    <pic:cNvPr id="1640686306" name=""/>
+                    <pic:cNvPicPr/>
+                  </pic:nvPicPr>
+                  <pic:blipFill>
+                    <a:blip r:embed="rId7">
+                      <a:extLst>
+                        <a:ext uri="{28A0092B-C50C-407E-A947-70E740481C1C}">
+                          <a14:useLocalDpi xmlns:a14="http://schemas.microsoft.com/office/drawing/2010/main" val="0"/>
+                        </a:ext>
+                      </a:extLst>
+                    </a:blip>
+                    <a:stretch>
+                      <a:fillRect/>
+                    </a:stretch>
+                  </pic:blipFill>
+                  <pic:spPr>
+                    <a:xfrm>
+                      <a:off x="0" y="0"/>
+                      <a:ext cx="2114550" cy="4412615"/>
+                    </a:xfrm>
+                    <a:prstGeom prst="rect">
+                      <a:avLst/>
+                    </a:prstGeom>
+                  </pic:spPr>
+                </pic:pic>
+              </a:graphicData>
+            </a:graphic>
+            <wp14:sizeRelH relativeFrom="margin">
+              <wp14:pctWidth>0</wp14:pctWidth>
+            </wp14:sizeRelH>
+            <wp14:sizeRelV relativeFrom="margin">
+              <wp14:pctHeight>0</wp14:pctHeight>
+            </wp14:sizeRelV>
+          </wp:anchor>
+        </w:drawing>
+      </w:r>
+      <w:r>
+        <w:drawing>
+          <wp:anchor distT="0" distB="0" distL="114300" distR="114300" simplePos="0" relativeHeight="251661312" behindDoc="1" locked="0" layoutInCell="1" allowOverlap="1" wp14:anchorId="38EA9005" wp14:editId="3372568E">
+            <wp:simplePos x="0" y="0"/>
+            <wp:positionH relativeFrom="column">
+              <wp:posOffset>143510</wp:posOffset>
+            </wp:positionH>
+            <wp:positionV relativeFrom="paragraph">
+              <wp:posOffset>4689475</wp:posOffset>
+            </wp:positionV>
+            <wp:extent cx="2133600" cy="4429759"/>
+            <wp:effectExtent l="0" t="0" r="0" b="9525"/>
+            <wp:wrapNone/>
+            <wp:docPr id="1568751626" name="Picture 1"/>
+            <wp:cNvGraphicFramePr>
+              <a:graphicFrameLocks xmlns:a="http://schemas.openxmlformats.org/drawingml/2006/main" noChangeAspect="1"/>
+            </wp:cNvGraphicFramePr>
+            <a:graphic xmlns:a="http://schemas.openxmlformats.org/drawingml/2006/main">
+              <a:graphicData uri="http://schemas.openxmlformats.org/drawingml/2006/picture">
+                <pic:pic xmlns:pic="http://schemas.openxmlformats.org/drawingml/2006/picture">
+                  <pic:nvPicPr>
+                    <pic:cNvPr id="1568751626" name=""/>
+                    <pic:cNvPicPr/>
+                  </pic:nvPicPr>
+                  <pic:blipFill>
+                    <a:blip r:embed="rId8">
+                      <a:extLst>
+                        <a:ext uri="{28A0092B-C50C-407E-A947-70E740481C1C}">
+                          <a14:useLocalDpi xmlns:a14="http://schemas.microsoft.com/office/drawing/2010/main" val="0"/>
+                        </a:ext>
+                      </a:extLst>
+                    </a:blip>
+                    <a:stretch>
+                      <a:fillRect/>
+                    </a:stretch>
+                  </pic:blipFill>
+                  <pic:spPr>
+                    <a:xfrm>
+                      <a:off x="0" y="0"/>
+                      <a:ext cx="2133600" cy="4429759"/>
+                    </a:xfrm>
+                    <a:prstGeom prst="rect">
+                      <a:avLst/>
+                    </a:prstGeom>
+                  </pic:spPr>
+                </pic:pic>
+              </a:graphicData>
+            </a:graphic>
+            <wp14:sizeRelH relativeFrom="margin">
+              <wp14:pctWidth>0</wp14:pctWidth>
+            </wp14:sizeRelH>
+            <wp14:sizeRelV relativeFrom="margin">
+              <wp14:pctHeight>0</wp14:pctHeight>
+            </wp14:sizeRelV>
+          </wp:anchor>
+        </w:drawing>
+      </w:r>
+      <w:r>
+        <w:br w:type="page"/>
+      </w:r>
+    </w:p>
     <w:p>
       <w:pPr>
         <w:spacing w:after="120"/>
@@ -8108,6 +8228,7 @@
           <w:szCs w:val="22"/>
           <w:lang w:val="id-ID"/>
         </w:rPr>
+        <w:lastRenderedPageBreak/>
         <w:t xml:space="preserve">Tautan repositori: </w:t>
       </w:r>
       <w:r>
@@ -8274,7 +8395,7 @@
                 <w:rFonts w:ascii="Calibri" w:eastAsia="Calibri" w:hAnsi="Calibri" w:cs="Calibri"/>
                 <w:lang w:val="id-ID"/>
               </w:rPr>
-              <w:t xml:space="preserve">Paket tidak terpasang dengan benar saat menjalankan flutter pub add preferences</w:t>
+              <w:t>Paket tidak terpasang dengan benar saat menjalankan flutter pub add preferences</w:t>
             </w:r>
           </w:p>
         </w:tc>
@@ -8299,7 +8420,7 @@
                 <w:rFonts w:ascii="Calibri" w:eastAsia="Calibri" w:hAnsi="Calibri" w:cs="Calibri"/>
                 <w:lang w:val="id-ID"/>
               </w:rPr>
-              <w:t xml:space="preserve">Nama paket yang ditulis keliru; paket untuk key-value adalah shared_preferences, bukan preferences</w:t>
+              <w:t>Nama paket yang ditulis keliru; paket untuk key-value adalah shared_preferences, bukan preferences</w:t>
             </w:r>
           </w:p>
         </w:tc>
@@ -8324,7 +8445,7 @@
                 <w:rFonts w:ascii="Calibri" w:eastAsia="Calibri" w:hAnsi="Calibri" w:cs="Calibri"/>
                 <w:lang w:val="id-ID"/>
               </w:rPr>
-              <w:t xml:space="preserve">Menjalankan flutter pub add shared_preferences lalu flutter pub add sqflite path</w:t>
+              <w:t>Menjalankan flutter pub add shared_preferences lalu flutter pub add sqflite path</w:t>
             </w:r>
           </w:p>
         </w:tc>
@@ -8351,7 +8472,7 @@
                 <w:rFonts w:ascii="Calibri" w:eastAsia="Calibri" w:hAnsi="Calibri" w:cs="Calibri"/>
                 <w:lang w:val="id-ID"/>
               </w:rPr>
-              <w:t xml:space="preserve">Error: The method 'FormCatatanPage' isn't defined (Bagian C)</w:t>
+              <w:t>Error: The method 'FormCatatanPage' isn't defined (Bagian C)</w:t>
             </w:r>
           </w:p>
         </w:tc>
@@ -8376,7 +8497,7 @@
                 <w:rFonts w:ascii="Calibri" w:eastAsia="Calibri" w:hAnsi="Calibri" w:cs="Calibri"/>
                 <w:lang w:val="id-ID"/>
               </w:rPr>
-              <w:t xml:space="preserve">CatatanPage memanggil FormCatatanPage pada _buka(), padahal class tersebut baru dibuat di Bagian D</w:t>
+              <w:t>CatatanPage memanggil FormCatatanPage pada _buka(), padahal class tersebut baru dibuat di Bagian D</w:t>
             </w:r>
           </w:p>
         </w:tc>
@@ -8401,7 +8522,7 @@
                 <w:rFonts w:ascii="Calibri" w:eastAsia="Calibri" w:hAnsi="Calibri" w:cs="Calibri"/>
                 <w:lang w:val="id-ID"/>
               </w:rPr>
-              <w:t xml:space="preserve">Menambahkan class FormCatatanPage dari Bagian D di bagian bawah main.dart</w:t>
+              <w:t>Menambahkan class FormCatatanPage dari Bagian D di bagian bawah main.dart</w:t>
             </w:r>
           </w:p>
         </w:tc>
@@ -8428,7 +8549,7 @@
                 <w:rFonts w:ascii="Calibri" w:eastAsia="Calibri" w:hAnsi="Calibri" w:cs="Calibri"/>
                 <w:lang w:val="id-ID"/>
               </w:rPr>
-              <w:t xml:space="preserve">Error kompilasi pada DbHelper saat Latihan 2 (pencarian)</w:t>
+              <w:t>Error kompilasi pada DbHelper saat Latihan 2 (pencarian)</w:t>
             </w:r>
           </w:p>
         </w:tc>
@@ -8453,7 +8574,7 @@
                 <w:rFonts w:ascii="Calibri" w:eastAsia="Calibri" w:hAnsi="Calibri" w:cs="Calibri"/>
                 <w:lang w:val="id-ID"/>
               </w:rPr>
-              <w:t xml:space="preserve">Saat mengganti method semua(), getter database ikut terhapus dan method semua() versi lama masih tertinggal sehingga ada dua method bernama sama</w:t>
+              <w:t>Saat mengganti method semua(), getter database ikut terhapus dan method semua() versi lama masih tertinggal sehingga ada dua method bernama sama</w:t>
             </w:r>
           </w:p>
         </w:tc>
@@ -8478,7 +8599,7 @@
                 <w:rFonts w:ascii="Calibri" w:eastAsia="Calibri" w:hAnsi="Calibri" w:cs="Calibri"/>
                 <w:lang w:val="id-ID"/>
               </w:rPr>
-              <w:t xml:space="preserve">Mengganti seluruh class DbHelper: getter database dikembalikan dan hanya menyisakan semua({String kata = ''}) dengan where judul LIKE ?</w:t>
+              <w:t>Mengganti seluruh class DbHelper: getter database dikembalikan dan hanya menyisakan semua({String kata = ''}) dengan where judul LIKE ?</w:t>
             </w:r>
           </w:p>
         </w:tc>
@@ -8505,7 +8626,7 @@
                 <w:rFonts w:ascii="Calibri" w:eastAsia="Calibri" w:hAnsi="Calibri" w:cs="Calibri"/>
                 <w:lang w:val="id-ID"/>
               </w:rPr>
-              <w:t xml:space="preserve">Error table catatan has no column named dibuat (Latihan 3)</w:t>
+              <w:t>Error table catatan has no column named dibuat (Latihan 3)</w:t>
             </w:r>
           </w:p>
         </w:tc>
@@ -8530,7 +8651,7 @@
                 <w:rFonts w:ascii="Calibri" w:eastAsia="Calibri" w:hAnsi="Calibri" w:cs="Calibri"/>
                 <w:lang w:val="id-ID"/>
               </w:rPr>
-              <w:t xml:space="preserve">Kolom dibuat ditambahkan pada model, tetapi version database masih 1 sehingga onCreate tidak dijalankan lagi untuk database yang sudah ada</w:t>
+              <w:t>Kolom dibuat ditambahkan pada model, tetapi version database masih 1 sehingga onCreate tidak dijalankan lagi untuk database yang sudah ada</w:t>
             </w:r>
           </w:p>
         </w:tc>
@@ -8555,7 +8676,7 @@
                 <w:rFonts w:ascii="Calibri" w:eastAsia="Calibri" w:hAnsi="Calibri" w:cs="Calibri"/>
                 <w:lang w:val="id-ID"/>
               </w:rPr>
-              <w:t xml:space="preserve">Menaikkan version menjadi 2 dan menambahkan onUpgrade berisi ALTER TABLE catatan ADD COLUMN dibuat TEXT; catatan lama tetap ada dengan tanggal kosong</w:t>
+              <w:t>Menaikkan version menjadi 2 dan menambahkan onUpgrade berisi ALTER TABLE catatan ADD COLUMN dibuat TEXT; catatan lama tetap ada dengan tanggal kosong</w:t>
             </w:r>
           </w:p>
         </w:tc>
@@ -8582,7 +8703,7 @@
                 <w:rFonts w:ascii="Calibri" w:eastAsia="Calibri" w:hAnsi="Calibri" w:cs="Calibri"/>
                 <w:lang w:val="id-ID"/>
               </w:rPr>
-              <w:t xml:space="preserve">Tombol Run membuka aplikasi di Chrome/Windows (desktop), bukan di emulator Android</w:t>
+              <w:t>Tombol Run membuka aplikasi di Chrome/Windows (desktop), bukan di emulator Android</w:t>
             </w:r>
           </w:p>
         </w:tc>
@@ -8607,7 +8728,7 @@
                 <w:rFonts w:ascii="Calibri" w:eastAsia="Calibri" w:hAnsi="Calibri" w:cs="Calibri"/>
                 <w:lang w:val="id-ID"/>
               </w:rPr>
-              <w:t xml:space="preserve">Target device pada toolbar Android Studio masih Windows (desktop)/Chrome (web); sqflite juga tidak berjalan di web</w:t>
+              <w:t>Target device pada toolbar Android Studio masih Windows (desktop)/Chrome (web); sqflite juga tidak berjalan di web</w:t>
             </w:r>
           </w:p>
         </w:tc>
@@ -8632,7 +8753,7 @@
                 <w:rFonts w:ascii="Calibri" w:eastAsia="Calibri" w:hAnsi="Calibri" w:cs="Calibri"/>
                 <w:lang w:val="id-ID"/>
               </w:rPr>
-              <w:t xml:space="preserve">Memilih Pixel 8 API 36.1 pada dropdown device sebelum menekan Run</w:t>
+              <w:t>Memilih Pixel 8 API 36.1 pada dropdown device sebelum menekan Run</w:t>
             </w:r>
           </w:p>
         </w:tc>
@@ -8659,7 +8780,7 @@
                 <w:rFonts w:ascii="Calibri" w:eastAsia="Calibri" w:hAnsi="Calibri" w:cs="Calibri"/>
                 <w:lang w:val="id-ID"/>
               </w:rPr>
-              <w:t xml:space="preserve">Potensi LateInitializationError pada _future di PengeluaranPage</w:t>
+              <w:t>Potensi LateInitializationError pada _future di PengeluaranPage</w:t>
             </w:r>
           </w:p>
         </w:tc>
@@ -8684,7 +8805,7 @@
                 <w:rFonts w:ascii="Calibri" w:eastAsia="Calibri" w:hAnsi="Calibri" w:cs="Calibri"/>
                 <w:lang w:val="id-ID"/>
               </w:rPr>
-              <w:t xml:space="preserve">_future baru diisi di dalam _muatFilterTersimpan() yang async, sehingga build() pertama dapat berjalan sebelum _future diinisialisasi</w:t>
+              <w:t>_future baru diisi di dalam _muatFilterTersimpan() yang async, sehingga build() pertama dapat berjalan sebelum _future diinisialisasi</w:t>
             </w:r>
           </w:p>
         </w:tc>
@@ -8709,7 +8830,7 @@
                 <w:rFonts w:ascii="Calibri" w:eastAsia="Calibri" w:hAnsi="Calibri" w:cs="Calibri"/>
                 <w:lang w:val="id-ID"/>
               </w:rPr>
-              <w:t xml:space="preserve">Mengisi _future = DbHelper.semua() di initState() sebelum memanggil _muatFilterTersimpan()</w:t>
+              <w:t>Mengisi _future = DbHelper.semua() di initState() sebelum memanggil _muatFilterTersimpan()</w:t>
             </w:r>
           </w:p>
         </w:tc>
@@ -8736,7 +8857,7 @@
                 <w:rFonts w:ascii="Calibri" w:eastAsia="Calibri" w:hAnsi="Calibri" w:cs="Calibri"/>
                 <w:lang w:val="id-ID"/>
               </w:rPr>
-              <w:t xml:space="preserve">Dropdown filter tetap menampilkan Semua padahal filter tersimpan berbeda</w:t>
+              <w:t>Dropdown filter tetap menampilkan Semua padahal filter tersimpan berbeda</w:t>
             </w:r>
           </w:p>
         </w:tc>
@@ -8761,7 +8882,7 @@
                 <w:rFonts w:ascii="Calibri" w:eastAsia="Calibri" w:hAnsi="Calibri" w:cs="Calibri"/>
                 <w:lang w:val="id-ID"/>
               </w:rPr>
-              <w:t xml:space="preserve">initialValue pada DropdownButtonFormField hanya dibaca sekali saat widget pertama dibuat, sebelum filter dari shared_preferences selesai dimuat</w:t>
+              <w:t>initialValue pada DropdownButtonFormField hanya dibaca sekali saat widget pertama dibuat, sebelum filter dari shared_preferences selesai dimuat</w:t>
             </w:r>
           </w:p>
         </w:tc>
@@ -8786,7 +8907,7 @@
                 <w:rFonts w:ascii="Calibri" w:eastAsia="Calibri" w:hAnsi="Calibri" w:cs="Calibri"/>
                 <w:lang w:val="id-ID"/>
               </w:rPr>
-              <w:t xml:space="preserve">Menambahkan key: ValueKey(_filterKategori) agar dropdown dibangun ulang saat filter berubah</w:t>
+              <w:t>Menambahkan key: ValueKey(_filterKategori) agar dropdown dibangun ulang saat filter berubah</w:t>
             </w:r>
           </w:p>
         </w:tc>
@@ -8833,7 +8954,7 @@
           <w:szCs w:val="22"/>
           <w:lang w:val="id-ID"/>
         </w:rPr>
-        <w:t xml:space="preserve">shared_preferences dirancang untuk data kecil berbentuk key-value seperti pengaturan. Untuk ratusan catatan, seluruh data harus disimpan sebagai satu teks atau banyak kunci, lalu dibaca dan ditulis ulang seluruhnya setiap ada perubahan, tanpa kemampuan mencari, mengurutkan, atau memfilter. Pilihan yang lebih baik adalah database SQLite (sqflite), yang menyimpan data terstruktur dalam tabel dan mendukung query seperti WHERE, ORDER BY, dan SUM.</w:t>
+        <w:t>shared_preferences dirancang untuk data kecil berbentuk key-value seperti pengaturan. Untuk ratusan catatan, seluruh data harus disimpan sebagai satu teks atau banyak kunci, lalu dibaca dan ditulis ulang seluruhnya setiap ada perubahan, tanpa kemampuan mencari, mengurutkan, atau memfilter. Pilihan yang lebih baik adalah database SQLite (sqflite), yang menyimpan data terstruktur dalam tabel dan mendukung query seperti WHERE, ORDER BY, dan SUM.</w:t>
       </w:r>
     </w:p>
     <w:p>
@@ -8856,7 +8977,17 @@
           <w:szCs w:val="22"/>
           <w:lang w:val="id-ID"/>
         </w:rPr>
-        <w:t xml:space="preserve">Placeholder ? dan whereArgs membuat nilai dari pengguna dikirim terpisah dari perintah SQL, sehingga selalu diperlakukan sebagai data, bukan sebagai bagian perintah. Bila teks disambung langsung, input berisi tanda kutip atau potongan SQL dapat mengubah arti query (SQL injection), misalnya menghapus atau membaca seluruh data. Placeholder juga menangani karakter khusus secara otomatis.</w:t>
+        <w:t xml:space="preserve">Placeholder ? dan whereArgs membuat nilai dari pengguna dikirim terpisah dari perintah SQL, sehingga selalu diperlakukan sebagai data, bukan sebagai bagian perintah. Bila teks disambung langsung, input berisi tanda kutip atau potongan SQL dapat mengubah arti query (SQL injection), </w:t>
+      </w:r>
+      <w:r>
+        <w:rPr>
+          <w:rFonts w:ascii="Calibri" w:eastAsia="Calibri" w:hAnsi="Calibri" w:cs="Calibri"/>
+          <w:sz w:val="22"/>
+          <w:szCs w:val="22"/>
+          <w:lang w:val="id-ID"/>
+        </w:rPr>
+        <w:lastRenderedPageBreak/>
+        <w:t>misalnya menghapus atau membaca seluruh data. Placeholder juga menangani karakter khusus secara otomatis.</w:t>
       </w:r>
     </w:p>
     <w:p>
@@ -8879,7 +9010,7 @@
           <w:szCs w:val="22"/>
           <w:lang w:val="id-ID"/>
         </w:rPr>
-        <w:t xml:space="preserve">FutureBuilder hanya menampilkan hasil Future yang sudah dibuat sebelumnya, sehingga perubahan data di halaman form tidak otomatis terlihat di halaman daftar. Pada kode ini, _buka() menunggu Navigator.push selesai (await), lalu memanggil _muat() yang membuat Future baru dari DbHelper di dalam setState. FutureBuilder kemudian membangun ulang daftar dengan data terbaru.</w:t>
+        <w:t>FutureBuilder hanya menampilkan hasil Future yang sudah dibuat sebelumnya, sehingga perubahan data di halaman form tidak otomatis terlihat di halaman daftar. Pada kode ini, _buka() menunggu Navigator.push selesai (await), lalu memanggil _muat() yang membuat Future baru dari DbHelper di dalam setState. FutureBuilder kemudian membangun ulang daftar dengan data terbaru.</w:t>
       </w:r>
     </w:p>
     <w:p>
@@ -8902,7 +9033,7 @@
           <w:szCs w:val="22"/>
           <w:lang w:val="id-ID"/>
         </w:rPr>
-        <w:t xml:space="preserve">onCreate dijalankan satu kali ketika file database belum ada, yaitu saat aplikasi pertama kali dipasang, dan berisi pembuatan tabel awal. onUpgrade dijalankan ketika database sudah ada tetapi nilai version di kode lebih besar dari versi yang tersimpan; isinya perubahan skema seperti ALTER TABLE, sehingga struktur tabel diperbarui tanpa menghapus data lama.</w:t>
+        <w:t>onCreate dijalankan satu kali ketika file database belum ada, yaitu saat aplikasi pertama kali dipasang, dan berisi pembuatan tabel awal. onUpgrade dijalankan ketika database sudah ada tetapi nilai version di kode lebih besar dari versi yang tersimpan; isinya perubahan skema seperti ALTER TABLE, sehingga struktur tabel diperbarui tanpa menghapus data lama.</w:t>
       </w:r>
     </w:p>
     <w:sectPr>

</xml_diff>